<commit_message>
docs: incorporar Swagger/OpenAPI implementado en ambas memorias
</commit_message>
<xml_diff>
--- a/docs/MEMORIA.docx
+++ b/docs/MEMORIA.docx
@@ -6321,7 +6321,23 @@
         <w:pStyle w:val="FirstParagraph"/>
       </w:pPr>
       <w:r>
-        <w:t xml:space="preserve">La API no dispone actualmente de documentación OpenAPI 3 / Swagger. Todas las rutas, métodos, parámetros y respuestas están descritos en la tabla de §4.4 y en los tests automatizados de §4.10. La integración de</w:t>
+        <w:t xml:space="preserve">La API expone documentación interactiva</w:t>
+      </w:r>
+      <w:r>
+        <w:t xml:space="preserve"> </w:t>
+      </w:r>
+      <w:r>
+        <w:rPr>
+          <w:bCs/>
+          <w:b/>
+        </w:rPr>
+        <w:t xml:space="preserve">OpenAPI 3.0</w:t>
+      </w:r>
+      <w:r>
+        <w:t xml:space="preserve"> </w:t>
+      </w:r>
+      <w:r>
+        <w:t xml:space="preserve">mediante</w:t>
       </w:r>
       <w:r>
         <w:t xml:space="preserve"> </w:t>
@@ -6333,10 +6349,273 @@
         <w:t xml:space="preserve">swagger-ui-express</w:t>
       </w:r>
       <w:r>
-        <w:t xml:space="preserve"> </w:t>
-      </w:r>
-      <w:r>
-        <w:t xml:space="preserve">con un esquema OpenAPI 3 generado a partir de JSDoc está planificada como mejora futura.</w:t>
+        <w:t xml:space="preserve">, accesible en</w:t>
+      </w:r>
+      <w:r>
+        <w:t xml:space="preserve"> </w:t>
+      </w:r>
+      <w:r>
+        <w:rPr>
+          <w:rStyle w:val="VerbatimChar"/>
+        </w:rPr>
+        <w:t xml:space="preserve">/api/docs</w:t>
+      </w:r>
+      <w:r>
+        <w:t xml:space="preserve">. La especificación completa está centralizada en</w:t>
+      </w:r>
+      <w:r>
+        <w:t xml:space="preserve"> </w:t>
+      </w:r>
+      <w:r>
+        <w:rPr>
+          <w:rStyle w:val="VerbatimChar"/>
+        </w:rPr>
+        <w:t xml:space="preserve">backend/src/swagger.js</w:t>
+      </w:r>
+      <w:r>
+        <w:t xml:space="preserve"> </w:t>
+      </w:r>
+      <w:r>
+        <w:t xml:space="preserve">como un objeto JavaScript (sin JSDoc disperso en los routers), lo que facilita su mantenimiento.</w:t>
+      </w:r>
+    </w:p>
+    <w:p>
+      <w:pPr>
+        <w:pStyle w:val="SourceCode"/>
+      </w:pPr>
+      <w:r>
+        <w:rPr>
+          <w:rStyle w:val="VerbatimChar"/>
+        </w:rPr>
+        <w:t xml:space="preserve">GET  /api/docs       → Swagger UI interactivo (HTML)</w:t>
+      </w:r>
+      <w:r>
+        <w:br/>
+      </w:r>
+      <w:r>
+        <w:rPr>
+          <w:rStyle w:val="VerbatimChar"/>
+        </w:rPr>
+        <w:t xml:space="preserve">GET  /api/docs.json  → Especificación OpenAPI 3.0 (JSON, importable en Postman)</w:t>
+      </w:r>
+    </w:p>
+    <w:p>
+      <w:pPr>
+        <w:pStyle w:val="FirstParagraph"/>
+      </w:pPr>
+      <w:r>
+        <w:t xml:space="preserve">La documentación cubre los</w:t>
+      </w:r>
+      <w:r>
+        <w:t xml:space="preserve"> </w:t>
+      </w:r>
+      <w:r>
+        <w:rPr>
+          <w:bCs/>
+          <w:b/>
+        </w:rPr>
+        <w:t xml:space="preserve">29 endpoints</w:t>
+      </w:r>
+      <w:r>
+        <w:t xml:space="preserve"> </w:t>
+      </w:r>
+      <w:r>
+        <w:t xml:space="preserve">de la API agrupados en seis etiquetas:</w:t>
+      </w:r>
+      <w:r>
+        <w:t xml:space="preserve"> </w:t>
+      </w:r>
+      <w:r>
+        <w:rPr>
+          <w:iCs/>
+          <w:i/>
+        </w:rPr>
+        <w:t xml:space="preserve">Autenticación</w:t>
+      </w:r>
+      <w:r>
+        <w:t xml:space="preserve">,</w:t>
+      </w:r>
+      <w:r>
+        <w:t xml:space="preserve"> </w:t>
+      </w:r>
+      <w:r>
+        <w:rPr>
+          <w:iCs/>
+          <w:i/>
+        </w:rPr>
+        <w:t xml:space="preserve">Categorías</w:t>
+      </w:r>
+      <w:r>
+        <w:t xml:space="preserve">,</w:t>
+      </w:r>
+      <w:r>
+        <w:t xml:space="preserve"> </w:t>
+      </w:r>
+      <w:r>
+        <w:rPr>
+          <w:iCs/>
+          <w:i/>
+        </w:rPr>
+        <w:t xml:space="preserve">Productos</w:t>
+      </w:r>
+      <w:r>
+        <w:t xml:space="preserve">,</w:t>
+      </w:r>
+      <w:r>
+        <w:t xml:space="preserve"> </w:t>
+      </w:r>
+      <w:r>
+        <w:rPr>
+          <w:iCs/>
+          <w:i/>
+        </w:rPr>
+        <w:t xml:space="preserve">Reservas</w:t>
+      </w:r>
+      <w:r>
+        <w:t xml:space="preserve">,</w:t>
+      </w:r>
+      <w:r>
+        <w:t xml:space="preserve"> </w:t>
+      </w:r>
+      <w:r>
+        <w:rPr>
+          <w:iCs/>
+          <w:i/>
+        </w:rPr>
+        <w:t xml:space="preserve">Admin</w:t>
+      </w:r>
+      <w:r>
+        <w:t xml:space="preserve"> </w:t>
+      </w:r>
+      <w:r>
+        <w:t xml:space="preserve">y</w:t>
+      </w:r>
+      <w:r>
+        <w:t xml:space="preserve"> </w:t>
+      </w:r>
+      <w:r>
+        <w:rPr>
+          <w:iCs/>
+          <w:i/>
+        </w:rPr>
+        <w:t xml:space="preserve">Sistema</w:t>
+      </w:r>
+      <w:r>
+        <w:t xml:space="preserve">. Para cada endpoint se detallan parámetros de ruta y query, esquema del body, posibles respuestas y el rol requerido. El botón</w:t>
+      </w:r>
+      <w:r>
+        <w:t xml:space="preserve"> </w:t>
+      </w:r>
+      <w:r>
+        <w:rPr>
+          <w:bCs/>
+          <w:b/>
+        </w:rPr>
+        <w:t xml:space="preserve">Authorize</w:t>
+      </w:r>
+      <w:r>
+        <w:t xml:space="preserve"> </w:t>
+      </w:r>
+      <w:r>
+        <w:t xml:space="preserve">permite introducir el token JWT obtenido en</w:t>
+      </w:r>
+      <w:r>
+        <w:t xml:space="preserve"> </w:t>
+      </w:r>
+      <w:r>
+        <w:rPr>
+          <w:rStyle w:val="VerbatimChar"/>
+        </w:rPr>
+        <w:t xml:space="preserve">/api/auth/login</w:t>
+      </w:r>
+      <w:r>
+        <w:t xml:space="preserve"> </w:t>
+      </w:r>
+      <w:r>
+        <w:t xml:space="preserve">y probar directamente cualquier endpoint protegido sin herramientas externas.</w:t>
+      </w:r>
+    </w:p>
+    <w:p>
+      <w:pPr>
+        <w:pStyle w:val="BodyText"/>
+      </w:pPr>
+      <w:r>
+        <w:t xml:space="preserve">Se definen además esquemas reutilizables en</w:t>
+      </w:r>
+      <w:r>
+        <w:t xml:space="preserve"> </w:t>
+      </w:r>
+      <w:r>
+        <w:rPr>
+          <w:rStyle w:val="VerbatimChar"/>
+        </w:rPr>
+        <w:t xml:space="preserve">components/schemas</w:t>
+      </w:r>
+      <w:r>
+        <w:t xml:space="preserve"> </w:t>
+      </w:r>
+      <w:r>
+        <w:t xml:space="preserve">(</w:t>
+      </w:r>
+      <w:r>
+        <w:rPr>
+          <w:rStyle w:val="VerbatimChar"/>
+        </w:rPr>
+        <w:t xml:space="preserve">Producto</w:t>
+      </w:r>
+      <w:r>
+        <w:t xml:space="preserve">,</w:t>
+      </w:r>
+      <w:r>
+        <w:t xml:space="preserve"> </w:t>
+      </w:r>
+      <w:r>
+        <w:rPr>
+          <w:rStyle w:val="VerbatimChar"/>
+        </w:rPr>
+        <w:t xml:space="preserve">Reserva</w:t>
+      </w:r>
+      <w:r>
+        <w:t xml:space="preserve">,</w:t>
+      </w:r>
+      <w:r>
+        <w:t xml:space="preserve"> </w:t>
+      </w:r>
+      <w:r>
+        <w:rPr>
+          <w:rStyle w:val="VerbatimChar"/>
+        </w:rPr>
+        <w:t xml:space="preserve">Usuario</w:t>
+      </w:r>
+      <w:r>
+        <w:t xml:space="preserve">,</w:t>
+      </w:r>
+      <w:r>
+        <w:t xml:space="preserve"> </w:t>
+      </w:r>
+      <w:r>
+        <w:rPr>
+          <w:rStyle w:val="VerbatimChar"/>
+        </w:rPr>
+        <w:t xml:space="preserve">Movimiento</w:t>
+      </w:r>
+      <w:r>
+        <w:t xml:space="preserve">, etc.) referenciados mediante</w:t>
+      </w:r>
+      <w:r>
+        <w:t xml:space="preserve"> </w:t>
+      </w:r>
+      <w:r>
+        <w:rPr>
+          <w:rStyle w:val="VerbatimChar"/>
+        </w:rPr>
+        <w:t xml:space="preserve">$ref</w:t>
+      </w:r>
+      <w:r>
+        <w:t xml:space="preserve"> </w:t>
+      </w:r>
+      <w:r>
+        <w:t xml:space="preserve">para evitar duplicación.</w:t>
       </w:r>
     </w:p>
     <w:bookmarkEnd w:id="56"/>
@@ -11913,7 +12192,7 @@
               <w:jc w:val="left"/>
             </w:pPr>
             <w:r>
-              <w:t xml:space="preserve">✅</w:t>
+              <w:t xml:space="preserve">OK</w:t>
             </w:r>
           </w:p>
         </w:tc>
@@ -11963,7 +12242,7 @@
               <w:jc w:val="left"/>
             </w:pPr>
             <w:r>
-              <w:t xml:space="preserve">✅</w:t>
+              <w:t xml:space="preserve">OK</w:t>
             </w:r>
           </w:p>
         </w:tc>
@@ -12013,7 +12292,7 @@
               <w:jc w:val="left"/>
             </w:pPr>
             <w:r>
-              <w:t xml:space="preserve">✅</w:t>
+              <w:t xml:space="preserve">OK</w:t>
             </w:r>
           </w:p>
         </w:tc>
@@ -12063,7 +12342,7 @@
               <w:jc w:val="left"/>
             </w:pPr>
             <w:r>
-              <w:t xml:space="preserve">✅</w:t>
+              <w:t xml:space="preserve">OK</w:t>
             </w:r>
           </w:p>
         </w:tc>
@@ -12113,7 +12392,7 @@
               <w:jc w:val="left"/>
             </w:pPr>
             <w:r>
-              <w:t xml:space="preserve">✅</w:t>
+              <w:t xml:space="preserve">OK</w:t>
             </w:r>
           </w:p>
         </w:tc>
@@ -12170,7 +12449,7 @@
               <w:jc w:val="left"/>
             </w:pPr>
             <w:r>
-              <w:t xml:space="preserve">✅</w:t>
+              <w:t xml:space="preserve">OK</w:t>
             </w:r>
           </w:p>
         </w:tc>
@@ -12220,7 +12499,7 @@
               <w:jc w:val="left"/>
             </w:pPr>
             <w:r>
-              <w:t xml:space="preserve">✅</w:t>
+              <w:t xml:space="preserve">OK</w:t>
             </w:r>
           </w:p>
         </w:tc>
@@ -12291,7 +12570,7 @@
               <w:jc w:val="left"/>
             </w:pPr>
             <w:r>
-              <w:t xml:space="preserve">✅</w:t>
+              <w:t xml:space="preserve">OK</w:t>
             </w:r>
           </w:p>
         </w:tc>
@@ -12341,7 +12620,7 @@
               <w:jc w:val="left"/>
             </w:pPr>
             <w:r>
-              <w:t xml:space="preserve">✅</w:t>
+              <w:t xml:space="preserve">OK</w:t>
             </w:r>
           </w:p>
         </w:tc>
@@ -12391,7 +12670,7 @@
               <w:jc w:val="left"/>
             </w:pPr>
             <w:r>
-              <w:t xml:space="preserve">✅</w:t>
+              <w:t xml:space="preserve">OK</w:t>
             </w:r>
           </w:p>
         </w:tc>
@@ -12773,7 +13052,7 @@
         </w:r>
       </w:hyperlink>
       <w:r>
-        <w:t xml:space="preserve">. Lo más relevante: mejoras sobre la app Android existente (BiometricPrompt para desbloquear sesión guardada, Room + cola offline para operar sin red, escáner de código de barras con CameraX + ML Kit), Swagger/OpenAPI, validación con Zod, accesibilidad WCAG AA completa, workflow CI/CD formal en GitHub Actions, subida de imágenes de producto, notificaciones push (FCM), recuperación de contraseña por email y multi-almacén.</w:t>
+        <w:t xml:space="preserve">. Lo más relevante: mejoras sobre la app Android existente (BiometricPrompt para desbloquear sesión guardada, Room + cola offline para operar sin red, escáner de código de barras con CameraX + ML Kit), validación con Zod, accesibilidad WCAG AA completa, workflow CI/CD formal en GitHub Actions, subida de imágenes de producto, notificaciones push (FCM), recuperación de contraseña por email y multi-almacén.</w:t>
       </w:r>
     </w:p>
     <w:bookmarkEnd w:id="102"/>
@@ -13412,13 +13691,13 @@
           <w:bCs/>
           <w:b/>
         </w:rPr>
-        <w:t xml:space="preserve">Swagger / OpenAPI:</w:t>
-      </w:r>
-      <w:r>
-        <w:t xml:space="preserve"> </w:t>
-      </w:r>
-      <w:r>
-        <w:t xml:space="preserve">pendiente.</w:t>
+        <w:t xml:space="preserve">Swagger UI:</w:t>
+      </w:r>
+      <w:r>
+        <w:t xml:space="preserve"> </w:t>
+      </w:r>
+      <w:r>
+        <w:t xml:space="preserve">https://tfgdam-production.up.railway.app/api/docs</w:t>
       </w:r>
     </w:p>
     <w:p>

</xml_diff>